<commit_message>
fixed 14 agian and starting 15
</commit_message>
<xml_diff>
--- a/docs/ecostats_lectures/lecture_15/15_01_lecture_powerpoint.docx
+++ b/docs/ecostats_lectures/lecture_15/15_01_lecture_powerpoint.docx
@@ -38,14 +38,6 @@
     </w:p>
     <w:p>
       <w:pPr>
-        <w:pStyle w:val="FirstParagraph"/>
-      </w:pPr>
-      <w:r>
-        <w:t xml:space="preserve">General Linearized Models (GLM)</w:t>
-      </w:r>
-    </w:p>
-    <w:p>
-      <w:pPr>
         <w:pStyle w:val="Compact"/>
         <w:numPr>
           <w:ilvl w:val="0"/>
@@ -53,6 +45,18 @@
         </w:numPr>
       </w:pPr>
       <w:r>
+        <w:t xml:space="preserve">General Linear Models (GLM)</w:t>
+      </w:r>
+    </w:p>
+    <w:p>
+      <w:pPr>
+        <w:pStyle w:val="Compact"/>
+        <w:numPr>
+          <w:ilvl w:val="1"/>
+          <w:numId w:val="1002"/>
+        </w:numPr>
+      </w:pPr>
+      <w:r>
         <w:t xml:space="preserve">Gaussian GLMs (normal distribution)</w:t>
       </w:r>
     </w:p>
@@ -60,8 +64,8 @@
       <w:pPr>
         <w:pStyle w:val="Compact"/>
         <w:numPr>
-          <w:ilvl w:val="0"/>
-          <w:numId w:val="1001"/>
+          <w:ilvl w:val="1"/>
+          <w:numId w:val="1002"/>
         </w:numPr>
       </w:pPr>
       <w:r>
@@ -72,8 +76,8 @@
       <w:pPr>
         <w:pStyle w:val="Compact"/>
         <w:numPr>
-          <w:ilvl w:val="0"/>
-          <w:numId w:val="1001"/>
+          <w:ilvl w:val="1"/>
+          <w:numId w:val="1002"/>
         </w:numPr>
       </w:pPr>
       <w:r>
@@ -84,8 +88,8 @@
       <w:pPr>
         <w:pStyle w:val="Compact"/>
         <w:numPr>
-          <w:ilvl w:val="0"/>
-          <w:numId w:val="1001"/>
+          <w:ilvl w:val="1"/>
+          <w:numId w:val="1002"/>
         </w:numPr>
       </w:pPr>
       <w:r>
@@ -96,8 +100,8 @@
       <w:pPr>
         <w:pStyle w:val="Compact"/>
         <w:numPr>
-          <w:ilvl w:val="0"/>
-          <w:numId w:val="1001"/>
+          <w:ilvl w:val="1"/>
+          <w:numId w:val="1002"/>
         </w:numPr>
       </w:pPr>
       <w:r>
@@ -126,7 +130,11 @@
     </w:p>
     <w:p>
       <w:pPr>
-        <w:pStyle w:val="FirstParagraph"/>
+        <w:pStyle w:val="Compact"/>
+        <w:numPr>
+          <w:ilvl w:val="0"/>
+          <w:numId w:val="1003"/>
+        </w:numPr>
       </w:pPr>
       <w:r>
         <w:t xml:space="preserve">Analysis of covariance (ANCOVA):</w:t>
@@ -136,8 +144,8 @@
       <w:pPr>
         <w:pStyle w:val="Compact"/>
         <w:numPr>
-          <w:ilvl w:val="0"/>
-          <w:numId w:val="1002"/>
+          <w:ilvl w:val="1"/>
+          <w:numId w:val="1004"/>
         </w:numPr>
       </w:pPr>
       <w:r>
@@ -148,8 +156,8 @@
       <w:pPr>
         <w:pStyle w:val="Compact"/>
         <w:numPr>
-          <w:ilvl w:val="0"/>
-          <w:numId w:val="1002"/>
+          <w:ilvl w:val="1"/>
+          <w:numId w:val="1004"/>
         </w:numPr>
       </w:pPr>
       <w:r>
@@ -160,8 +168,8 @@
       <w:pPr>
         <w:pStyle w:val="Compact"/>
         <w:numPr>
-          <w:ilvl w:val="0"/>
-          <w:numId w:val="1002"/>
+          <w:ilvl w:val="1"/>
+          <w:numId w:val="1004"/>
         </w:numPr>
       </w:pPr>
       <w:r>
@@ -172,8 +180,8 @@
       <w:pPr>
         <w:pStyle w:val="Compact"/>
         <w:numPr>
-          <w:ilvl w:val="0"/>
-          <w:numId w:val="1002"/>
+          <w:ilvl w:val="1"/>
+          <w:numId w:val="1004"/>
         </w:numPr>
       </w:pPr>
       <w:r>
@@ -184,8 +192,8 @@
       <w:pPr>
         <w:pStyle w:val="Compact"/>
         <w:numPr>
-          <w:ilvl w:val="0"/>
-          <w:numId w:val="1002"/>
+          <w:ilvl w:val="1"/>
+          <w:numId w:val="1004"/>
         </w:numPr>
       </w:pPr>
       <w:r>
@@ -196,56 +204,56 @@
       <w:pPr>
         <w:pStyle w:val="Compact"/>
         <w:numPr>
+          <w:ilvl w:val="2"/>
+          <w:numId w:val="1005"/>
+        </w:numPr>
+      </w:pPr>
+      <w:r>
+        <w:t xml:space="preserve">Homogeneous slopes</w:t>
+      </w:r>
+    </w:p>
+    <w:p>
+      <w:pPr>
+        <w:pStyle w:val="Compact"/>
+        <w:numPr>
           <w:ilvl w:val="1"/>
-          <w:numId w:val="1003"/>
-        </w:numPr>
-      </w:pPr>
-      <w:r>
-        <w:t xml:space="preserve">Homogeneous slopes</w:t>
+          <w:numId w:val="1004"/>
+        </w:numPr>
+      </w:pPr>
+      <w:r>
+        <w:t xml:space="preserve">Robust ANCOVA approaches</w:t>
       </w:r>
     </w:p>
     <w:p>
       <w:pPr>
         <w:pStyle w:val="Compact"/>
         <w:numPr>
-          <w:ilvl w:val="0"/>
-          <w:numId w:val="1002"/>
-        </w:numPr>
-      </w:pPr>
-      <w:r>
-        <w:t xml:space="preserve">Robust ANCOVA approaches</w:t>
+          <w:ilvl w:val="1"/>
+          <w:numId w:val="1004"/>
+        </w:numPr>
+      </w:pPr>
+      <w:r>
+        <w:t xml:space="preserve">Specific comparisons of means</w:t>
       </w:r>
     </w:p>
     <w:p>
       <w:pPr>
         <w:pStyle w:val="Compact"/>
         <w:numPr>
-          <w:ilvl w:val="0"/>
-          <w:numId w:val="1002"/>
-        </w:numPr>
-      </w:pPr>
-      <w:r>
-        <w:t xml:space="preserve">Specific comparisons of means</w:t>
+          <w:ilvl w:val="1"/>
+          <w:numId w:val="1004"/>
+        </w:numPr>
+      </w:pPr>
+      <w:r>
+        <w:t xml:space="preserve">Examples and interpretation</w:t>
       </w:r>
     </w:p>
     <w:p>
       <w:pPr>
         <w:pStyle w:val="Compact"/>
         <w:numPr>
-          <w:ilvl w:val="0"/>
-          <w:numId w:val="1002"/>
-        </w:numPr>
-      </w:pPr>
-      <w:r>
-        <w:t xml:space="preserve">Examples and interpretation</w:t>
-      </w:r>
-    </w:p>
-    <w:p>
-      <w:pPr>
-        <w:pStyle w:val="Compact"/>
-        <w:numPr>
-          <w:ilvl w:val="0"/>
-          <w:numId w:val="1002"/>
+          <w:ilvl w:val="1"/>
+          <w:numId w:val="1004"/>
         </w:numPr>
       </w:pPr>
       <w:r>
@@ -277,7 +285,7 @@
         <w:pStyle w:val="Compact"/>
         <w:numPr>
           <w:ilvl w:val="0"/>
-          <w:numId w:val="1004"/>
+          <w:numId w:val="1006"/>
         </w:numPr>
       </w:pPr>
       <w:r>
@@ -289,7 +297,7 @@
         <w:pStyle w:val="Compact"/>
         <w:numPr>
           <w:ilvl w:val="0"/>
-          <w:numId w:val="1004"/>
+          <w:numId w:val="1006"/>
         </w:numPr>
       </w:pPr>
       <w:r>
@@ -301,7 +309,7 @@
         <w:pStyle w:val="Compact"/>
         <w:numPr>
           <w:ilvl w:val="0"/>
-          <w:numId w:val="1004"/>
+          <w:numId w:val="1006"/>
         </w:numPr>
       </w:pPr>
       <w:r>
@@ -319,35 +327,59 @@
         <w:pStyle w:val="Compact"/>
         <w:numPr>
           <w:ilvl w:val="0"/>
-          <w:numId w:val="1004"/>
-        </w:numPr>
-      </w:pPr>
-      <w:r>
-        <w:t xml:space="preserve">Common use: compare means of factor levels (groups), adjusting for</w:t>
-      </w:r>
-      <w:r>
-        <w:t xml:space="preserve"> </w:t>
-      </w:r>
-      <w:r>
-        <w:t xml:space="preserve">variance from continuous covariate</w:t>
+          <w:numId w:val="1006"/>
+        </w:numPr>
+      </w:pPr>
+      <w:r>
+        <w:t xml:space="preserve">Common use:</w:t>
       </w:r>
     </w:p>
     <w:p>
       <w:pPr>
         <w:pStyle w:val="Compact"/>
         <w:numPr>
+          <w:ilvl w:val="1"/>
+          <w:numId w:val="1007"/>
+        </w:numPr>
+      </w:pPr>
+      <w:r>
+        <w:t xml:space="preserve">compare means of factor levels (groups), adjusting for variance</w:t>
+      </w:r>
+      <w:r>
+        <w:t xml:space="preserve"> </w:t>
+      </w:r>
+      <w:r>
+        <w:t xml:space="preserve">from continuous covariate</w:t>
+      </w:r>
+    </w:p>
+    <w:p>
+      <w:pPr>
+        <w:pStyle w:val="Compact"/>
+        <w:numPr>
           <w:ilvl w:val="0"/>
-          <w:numId w:val="1004"/>
-        </w:numPr>
-      </w:pPr>
-      <w:r>
-        <w:t xml:space="preserve">Another use: determine whether two or more regression lines differ</w:t>
-      </w:r>
-      <w:r>
-        <w:t xml:space="preserve"> </w:t>
-      </w:r>
-      <w:r>
-        <w:t xml:space="preserve">in slopes and intercepts</w:t>
+          <w:numId w:val="1006"/>
+        </w:numPr>
+      </w:pPr>
+      <w:r>
+        <w:t xml:space="preserve">Another use:</w:t>
+      </w:r>
+    </w:p>
+    <w:p>
+      <w:pPr>
+        <w:pStyle w:val="Compact"/>
+        <w:numPr>
+          <w:ilvl w:val="1"/>
+          <w:numId w:val="1008"/>
+        </w:numPr>
+      </w:pPr>
+      <w:r>
+        <w:t xml:space="preserve">determine whether two or more regression lines differ in slopes</w:t>
+      </w:r>
+      <w:r>
+        <w:t xml:space="preserve"> </w:t>
+      </w:r>
+      <w:r>
+        <w:t xml:space="preserve">and intercepts</w:t>
       </w:r>
     </w:p>
     <w:bookmarkEnd w:id="24"/>
@@ -422,7 +454,7 @@
         <w:pStyle w:val="Compact"/>
         <w:numPr>
           <w:ilvl w:val="0"/>
-          <w:numId w:val="1005"/>
+          <w:numId w:val="1009"/>
         </w:numPr>
       </w:pPr>
       <w:r>
@@ -438,7 +470,7 @@
         <w:pStyle w:val="Compact"/>
         <w:numPr>
           <w:ilvl w:val="1"/>
-          <w:numId w:val="1006"/>
+          <w:numId w:val="1010"/>
         </w:numPr>
       </w:pPr>
       <w:r>
@@ -456,7 +488,7 @@
         <w:pStyle w:val="Compact"/>
         <w:numPr>
           <w:ilvl w:val="1"/>
-          <w:numId w:val="1006"/>
+          <w:numId w:val="1010"/>
         </w:numPr>
       </w:pPr>
       <w:r>
@@ -468,7 +500,7 @@
         <w:pStyle w:val="Compact"/>
         <w:numPr>
           <w:ilvl w:val="0"/>
-          <w:numId w:val="1005"/>
+          <w:numId w:val="1009"/>
         </w:numPr>
       </w:pPr>
       <w:r>
@@ -484,7 +516,7 @@
         <w:pStyle w:val="Compact"/>
         <w:numPr>
           <w:ilvl w:val="1"/>
-          <w:numId w:val="1007"/>
+          <w:numId w:val="1011"/>
         </w:numPr>
       </w:pPr>
       <w:r>
@@ -496,7 +528,7 @@
         <w:pStyle w:val="Compact"/>
         <w:numPr>
           <w:ilvl w:val="1"/>
-          <w:numId w:val="1007"/>
+          <w:numId w:val="1011"/>
         </w:numPr>
       </w:pPr>
       <w:r>
@@ -508,7 +540,7 @@
         <w:pStyle w:val="Compact"/>
         <w:numPr>
           <w:ilvl w:val="0"/>
-          <w:numId w:val="1005"/>
+          <w:numId w:val="1009"/>
         </w:numPr>
       </w:pPr>
       <w:r>
@@ -524,7 +556,7 @@
         <w:pStyle w:val="Compact"/>
         <w:numPr>
           <w:ilvl w:val="1"/>
-          <w:numId w:val="1008"/>
+          <w:numId w:val="1012"/>
         </w:numPr>
       </w:pPr>
       <w:r>
@@ -542,7 +574,7 @@
         <w:pStyle w:val="Compact"/>
         <w:numPr>
           <w:ilvl w:val="1"/>
-          <w:numId w:val="1008"/>
+          <w:numId w:val="1012"/>
         </w:numPr>
       </w:pPr>
       <w:r>
@@ -571,7 +603,11 @@
     </w:p>
     <w:p>
       <w:pPr>
-        <w:pStyle w:val="FirstParagraph"/>
+        <w:pStyle w:val="Compact"/>
+        <w:numPr>
+          <w:ilvl w:val="0"/>
+          <w:numId w:val="1013"/>
+        </w:numPr>
       </w:pPr>
       <w:r>
         <w:t xml:space="preserve">Want to compare chirping rate of two cricket species:</w:t>
@@ -581,8 +617,8 @@
       <w:pPr>
         <w:pStyle w:val="Compact"/>
         <w:numPr>
-          <w:ilvl w:val="0"/>
-          <w:numId w:val="1009"/>
+          <w:ilvl w:val="1"/>
+          <w:numId w:val="1014"/>
         </w:numPr>
       </w:pPr>
       <w:r>
@@ -597,8 +633,8 @@
       <w:pPr>
         <w:pStyle w:val="Compact"/>
         <w:numPr>
-          <w:ilvl w:val="0"/>
-          <w:numId w:val="1009"/>
+          <w:ilvl w:val="1"/>
+          <w:numId w:val="1014"/>
         </w:numPr>
       </w:pPr>
       <w:r>
@@ -611,71 +647,79 @@
     </w:p>
     <w:p>
       <w:pPr>
+        <w:pStyle w:val="Compact"/>
+        <w:numPr>
+          <w:ilvl w:val="0"/>
+          <w:numId w:val="1013"/>
+        </w:numPr>
+      </w:pPr>
+      <w:r>
+        <w:t xml:space="preserve">But:</w:t>
+      </w:r>
+    </w:p>
+    <w:p>
+      <w:pPr>
+        <w:pStyle w:val="Compact"/>
+        <w:numPr>
+          <w:ilvl w:val="1"/>
+          <w:numId w:val="1015"/>
+        </w:numPr>
+      </w:pPr>
+      <w:r>
+        <w:t xml:space="preserve">Measured rates at different temperatures</w:t>
+      </w:r>
+    </w:p>
+    <w:p>
+      <w:pPr>
+        <w:pStyle w:val="Compact"/>
+        <w:numPr>
+          <w:ilvl w:val="1"/>
+          <w:numId w:val="1015"/>
+        </w:numPr>
+      </w:pPr>
+      <w:r>
+        <w:t xml:space="preserve">Range of temperatures differed between species</w:t>
+      </w:r>
+    </w:p>
+    <w:p>
+      <w:pPr>
+        <w:pStyle w:val="Compact"/>
+        <w:numPr>
+          <w:ilvl w:val="1"/>
+          <w:numId w:val="1015"/>
+        </w:numPr>
+      </w:pPr>
+      <w:r>
+        <w:t xml:space="preserve">Apparent relationship between pulse rate and temperature</w:t>
+      </w:r>
+    </w:p>
+    <w:p>
+      <w:pPr>
+        <w:pStyle w:val="Compact"/>
+        <w:numPr>
+          <w:ilvl w:val="0"/>
+          <w:numId w:val="1013"/>
+        </w:numPr>
+      </w:pPr>
+      <w:r>
+        <w:t xml:space="preserve">ANCOVA lets us adjust for temperature effect to get a more powerful</w:t>
+      </w:r>
+      <w:r>
+        <w:t xml:space="preserve"> </w:t>
+      </w:r>
+      <w:r>
+        <w:t xml:space="preserve">test!</w:t>
+      </w:r>
+    </w:p>
+    <w:bookmarkEnd w:id="31"/>
+    <w:p>
+      <w:pPr>
         <w:pStyle w:val="FirstParagraph"/>
-      </w:pPr>
-      <w:r>
-        <w:t xml:space="preserve">But:</w:t>
-      </w:r>
-    </w:p>
-    <w:p>
-      <w:pPr>
-        <w:pStyle w:val="Compact"/>
-        <w:numPr>
-          <w:ilvl w:val="0"/>
-          <w:numId w:val="1010"/>
-        </w:numPr>
-      </w:pPr>
-      <w:r>
-        <w:t xml:space="preserve">Measured rates at different temperatures</w:t>
-      </w:r>
-    </w:p>
-    <w:p>
-      <w:pPr>
-        <w:pStyle w:val="Compact"/>
-        <w:numPr>
-          <w:ilvl w:val="0"/>
-          <w:numId w:val="1010"/>
-        </w:numPr>
-      </w:pPr>
-      <w:r>
-        <w:t xml:space="preserve">Range of temperatures differed between species</w:t>
-      </w:r>
-    </w:p>
-    <w:p>
-      <w:pPr>
-        <w:pStyle w:val="Compact"/>
-        <w:numPr>
-          <w:ilvl w:val="0"/>
-          <w:numId w:val="1010"/>
-        </w:numPr>
-      </w:pPr>
-      <w:r>
-        <w:t xml:space="preserve">Apparent relationship between pulse rate and temperature</w:t>
-      </w:r>
-    </w:p>
-    <w:p>
-      <w:pPr>
-        <w:pStyle w:val="FirstParagraph"/>
-      </w:pPr>
-      <w:r>
-        <w:t xml:space="preserve">ANCOVA lets us adjust for temperature effect to get a more powerful</w:t>
-      </w:r>
-      <w:r>
-        <w:t xml:space="preserve"> </w:t>
-      </w:r>
-      <w:r>
-        <w:t xml:space="preserve">test!</w:t>
-      </w:r>
-    </w:p>
-    <w:bookmarkEnd w:id="31"/>
-    <w:p>
-      <w:pPr>
-        <w:pStyle w:val="BodyText"/>
       </w:pPr>
       <w:r>
         <w:drawing>
           <wp:inline>
-            <wp:extent cx="3657600" cy="3657600"/>
+            <wp:extent cx="2743200" cy="2743200"/>
             <wp:effectExtent b="0" l="0" r="0" t="0"/>
             <wp:docPr descr="" title="" id="33" name="Picture"/>
             <a:graphic>
@@ -696,7 +740,7 @@
                   <pic:spPr bwMode="auto">
                     <a:xfrm>
                       <a:off x="0" y="0"/>
-                      <a:ext cx="3657600" cy="3657600"/>
+                      <a:ext cx="2743200" cy="2743200"/>
                     </a:xfrm>
                     <a:prstGeom prst="rect">
                       <a:avLst/>
@@ -728,7 +772,7 @@
     <w:bookmarkStart w:id="36" w:name="the-ancova-model"/>
     <w:p>
       <w:pPr>
-        <w:pStyle w:val="Heading2"/>
+        <w:pStyle w:val="Heading3"/>
       </w:pPr>
       <w:r>
         <w:t xml:space="preserve">The ANCOVA Model</w:t>
@@ -736,7 +780,11 @@
     </w:p>
     <w:p>
       <w:pPr>
-        <w:pStyle w:val="FirstParagraph"/>
+        <w:pStyle w:val="Compact"/>
+        <w:numPr>
+          <w:ilvl w:val="0"/>
+          <w:numId w:val="1016"/>
+        </w:numPr>
       </w:pPr>
       <w:r>
         <w:t xml:space="preserve">Key concept in ANCOVA: the difference between</w:t>
@@ -751,13 +799,13 @@
         <w:t xml:space="preserve"> </w:t>
       </w:r>
       <w:r>
-        <w:t xml:space="preserve">group means</w:t>
-      </w:r>
-      <w:r>
-        <w:t xml:space="preserve"> </w:t>
-      </w:r>
-      <w:r>
-        <w:t xml:space="preserve">and</w:t>
+        <w:t xml:space="preserve">group</w:t>
+      </w:r>
+      <w:r>
+        <w:t xml:space="preserve"> </w:t>
+      </w:r>
+      <w:r>
+        <w:t xml:space="preserve">means and</w:t>
       </w:r>
       <w:r>
         <w:t xml:space="preserve"> </w:t>
@@ -774,7 +822,11 @@
     </w:p>
     <w:p>
       <w:pPr>
-        <w:pStyle w:val="BodyText"/>
+        <w:pStyle w:val="Compact"/>
+        <w:numPr>
+          <w:ilvl w:val="0"/>
+          <w:numId w:val="1016"/>
+        </w:numPr>
       </w:pPr>
       <w:r>
         <w:t xml:space="preserve">In this visualization:</w:t>
@@ -782,116 +834,98 @@
     </w:p>
     <w:p>
       <w:pPr>
+        <w:pStyle w:val="Compact"/>
+        <w:numPr>
+          <w:ilvl w:val="1"/>
+          <w:numId w:val="1017"/>
+        </w:numPr>
+      </w:pPr>
+      <w:r>
+        <w:t xml:space="preserve">Group Means (asterisks): unadjusted means for each group</w:t>
+      </w:r>
+    </w:p>
+    <w:p>
+      <w:pPr>
+        <w:pStyle w:val="Compact"/>
+        <w:numPr>
+          <w:ilvl w:val="2"/>
+          <w:numId w:val="1018"/>
+        </w:numPr>
+      </w:pPr>
+      <w:r>
+        <w:t xml:space="preserve">average X value and average Y value for all points in that group.</w:t>
+      </w:r>
+    </w:p>
+    <w:p>
+      <w:pPr>
+        <w:pStyle w:val="Compact"/>
+        <w:numPr>
+          <w:ilvl w:val="3"/>
+          <w:numId w:val="1019"/>
+        </w:numPr>
+      </w:pPr>
+      <w:r>
+        <w:t xml:space="preserve">Group A and Group B have different mean X values - different points along the X axis</w:t>
+      </w:r>
+    </w:p>
+    <w:p>
+      <w:pPr>
+        <w:pStyle w:val="Compact"/>
+        <w:numPr>
+          <w:ilvl w:val="1"/>
+          <w:numId w:val="1017"/>
+        </w:numPr>
+      </w:pPr>
+      <w:r>
+        <w:t xml:space="preserve">Adjusted Means (triangles): What ANCOVA actually compares</w:t>
+      </w:r>
+    </w:p>
+    <w:p>
+      <w:pPr>
+        <w:pStyle w:val="Compact"/>
+        <w:numPr>
+          <w:ilvl w:val="1"/>
+          <w:numId w:val="1017"/>
+        </w:numPr>
+      </w:pPr>
+      <w:r>
+        <w:t xml:space="preserve">adjusted means represent group’s mean if all groups had same value of covariate (overall mean X).</w:t>
+      </w:r>
+    </w:p>
+    <w:p>
+      <w:pPr>
+        <w:pStyle w:val="Compact"/>
         <w:numPr>
           <w:ilvl w:val="0"/>
-          <w:numId w:val="1011"/>
-        </w:numPr>
-      </w:pPr>
-      <w:r>
-        <w:t xml:space="preserve">Group Means (shown as asterisks): raw/unadjusted means for each</w:t>
-      </w:r>
-      <w:r>
-        <w:t xml:space="preserve"> </w:t>
-      </w:r>
-      <w:r>
-        <w:t xml:space="preserve">group - simply the average X value and average Y value for all</w:t>
-      </w:r>
-      <w:r>
-        <w:t xml:space="preserve"> </w:t>
-      </w:r>
-      <w:r>
-        <w:t xml:space="preserve">points in that group. Notice that Group A and Group B have different</w:t>
-      </w:r>
-      <w:r>
-        <w:t xml:space="preserve"> </w:t>
-      </w:r>
-      <w:r>
-        <w:t xml:space="preserve">mean X values (they’re positioned at different points along the X</w:t>
-      </w:r>
-      <w:r>
-        <w:t xml:space="preserve"> </w:t>
-      </w:r>
-      <w:r>
-        <w:t xml:space="preserve">axis).</w:t>
-      </w:r>
-    </w:p>
-    <w:p>
-      <w:pPr>
-        <w:numPr>
-          <w:ilvl w:val="0"/>
-          <w:numId w:val="1011"/>
-        </w:numPr>
-      </w:pPr>
-      <w:r>
-        <w:t xml:space="preserve">Adjusted Means (shown as triangles): These are what ANCOVA actually</w:t>
-      </w:r>
-      <w:r>
-        <w:t xml:space="preserve"> </w:t>
-      </w:r>
-      <w:r>
-        <w:t xml:space="preserve">compares. The adjusted means represent what each group’s mean would</w:t>
-      </w:r>
-      <w:r>
-        <w:t xml:space="preserve"> </w:t>
-      </w:r>
-      <w:r>
-        <w:t xml:space="preserve">be if all groups had the same value of the covariate (in this case,</w:t>
-      </w:r>
-      <w:r>
-        <w:t xml:space="preserve"> </w:t>
-      </w:r>
-      <w:r>
-        <w:t xml:space="preserve">the overall mean X).</w:t>
-      </w:r>
-    </w:p>
-    <w:p>
-      <w:pPr>
-        <w:pStyle w:val="FirstParagraph"/>
-      </w:pPr>
-      <w:r>
-        <w:t xml:space="preserve">The core purpose of ANCOVA is to make this adjustment. This is important</w:t>
-      </w:r>
-      <w:r>
-        <w:t xml:space="preserve"> </w:t>
-      </w:r>
-      <w:r>
-        <w:t xml:space="preserve">because:</w:t>
+          <w:numId w:val="1016"/>
+        </w:numPr>
+      </w:pPr>
+      <w:r>
+        <w:t xml:space="preserve">The core purpose of ANCOVA is to make this adjustment and important because:</w:t>
       </w:r>
     </w:p>
     <w:p>
       <w:pPr>
         <w:pStyle w:val="Compact"/>
         <w:numPr>
-          <w:ilvl w:val="0"/>
-          <w:numId w:val="1012"/>
-        </w:numPr>
-      </w:pPr>
-      <w:r>
-        <w:t xml:space="preserve">When groups differ in their covariate values (as they often do in</w:t>
-      </w:r>
-      <w:r>
-        <w:t xml:space="preserve"> </w:t>
-      </w:r>
-      <w:r>
-        <w:t xml:space="preserve">observational studies or even in experiments with random</w:t>
-      </w:r>
-      <w:r>
-        <w:t xml:space="preserve"> </w:t>
-      </w:r>
-      <w:r>
-        <w:t xml:space="preserve">assignment), comparing raw means can be misleading</w:t>
+          <w:ilvl w:val="1"/>
+          <w:numId w:val="1020"/>
+        </w:numPr>
+      </w:pPr>
+      <w:r>
+        <w:t xml:space="preserve">When groups differ in their covariate values (as they often do in observational studies or even in exps with random assignment), comparing raw means can be misleading</w:t>
       </w:r>
     </w:p>
     <w:p>
       <w:pPr>
         <w:pStyle w:val="Compact"/>
         <w:numPr>
-          <w:ilvl w:val="0"/>
-          <w:numId w:val="1012"/>
-        </w:numPr>
-      </w:pPr>
-      <w:r>
-        <w:t xml:space="preserve">The adjustment helps</w:t>
+          <w:ilvl w:val="1"/>
+          <w:numId w:val="1020"/>
+        </w:numPr>
+      </w:pPr>
+      <w:r>
+        <w:t xml:space="preserve">Adjustment helps</w:t>
       </w:r>
       <w:r>
         <w:t xml:space="preserve"> </w:t>
@@ -903,19 +937,13 @@
         <w:t xml:space="preserve"> </w:t>
       </w:r>
       <w:r>
-        <w:t xml:space="preserve">by estimating what</w:t>
-      </w:r>
-      <w:r>
-        <w:t xml:space="preserve"> </w:t>
-      </w:r>
-      <w:r>
-        <w:t xml:space="preserve">each group’s mean would be if they all had the same value of the</w:t>
-      </w:r>
-      <w:r>
-        <w:t xml:space="preserve"> </w:t>
-      </w:r>
-      <w:r>
-        <w:t xml:space="preserve">covariate</w:t>
+        <w:t xml:space="preserve">by estimating</w:t>
+      </w:r>
+      <w:r>
+        <w:t xml:space="preserve"> </w:t>
+      </w:r>
+      <w:r>
+        <w:t xml:space="preserve">what each group’s mean would be if all had same value of covariate</w:t>
       </w:r>
     </w:p>
     <w:bookmarkEnd w:id="36"/>
@@ -936,7 +964,7 @@
       <w:r>
         <w:drawing>
           <wp:inline>
-            <wp:extent cx="6578600" cy="4111625"/>
+            <wp:extent cx="2743200" cy="2743200"/>
             <wp:effectExtent b="0" l="0" r="0" t="0"/>
             <wp:docPr descr="" title="" id="39" name="Picture"/>
             <a:graphic>
@@ -957,7 +985,7 @@
                   <pic:spPr bwMode="auto">
                     <a:xfrm>
                       <a:off x="0" y="0"/>
-                      <a:ext cx="6578600" cy="4111625"/>
+                      <a:ext cx="2743200" cy="2743200"/>
                     </a:xfrm>
                     <a:prstGeom prst="rect">
                       <a:avLst/>
@@ -1320,7 +1348,7 @@
         <w:pStyle w:val="Compact"/>
         <w:numPr>
           <w:ilvl w:val="0"/>
-          <w:numId w:val="1013"/>
+          <w:numId w:val="1021"/>
         </w:numPr>
       </w:pPr>
       <m:oMath>
@@ -1340,7 +1368,7 @@
         <w:pStyle w:val="Compact"/>
         <w:numPr>
           <w:ilvl w:val="0"/>
-          <w:numId w:val="1013"/>
+          <w:numId w:val="1021"/>
         </w:numPr>
       </w:pPr>
       <m:oMath>
@@ -1375,7 +1403,7 @@
         <w:pStyle w:val="Compact"/>
         <w:numPr>
           <w:ilvl w:val="0"/>
-          <w:numId w:val="1013"/>
+          <w:numId w:val="1021"/>
         </w:numPr>
       </w:pPr>
       <m:oMath>
@@ -1395,7 +1423,7 @@
         <w:pStyle w:val="Compact"/>
         <w:numPr>
           <w:ilvl w:val="0"/>
-          <w:numId w:val="1013"/>
+          <w:numId w:val="1021"/>
         </w:numPr>
       </w:pPr>
       <m:oMath>
@@ -1427,7 +1455,7 @@
         <w:pStyle w:val="Compact"/>
         <w:numPr>
           <w:ilvl w:val="0"/>
-          <w:numId w:val="1013"/>
+          <w:numId w:val="1021"/>
         </w:numPr>
       </w:pPr>
       <m:oMath>
@@ -1454,7 +1482,7 @@
         <w:pStyle w:val="Compact"/>
         <w:numPr>
           <w:ilvl w:val="0"/>
-          <w:numId w:val="1013"/>
+          <w:numId w:val="1021"/>
         </w:numPr>
       </w:pPr>
       <m:oMath>
@@ -4281,7 +4309,7 @@
       <w:pPr>
         <w:numPr>
           <w:ilvl w:val="0"/>
-          <w:numId w:val="1014"/>
+          <w:numId w:val="1022"/>
         </w:numPr>
       </w:pPr>
       <w:r>
@@ -4401,7 +4429,7 @@
         <w:pStyle w:val="Compact"/>
         <w:numPr>
           <w:ilvl w:val="1"/>
-          <w:numId w:val="1015"/>
+          <w:numId w:val="1023"/>
         </w:numPr>
       </w:pPr>
       <w:r>
@@ -4413,7 +4441,7 @@
         <w:pStyle w:val="Compact"/>
         <w:numPr>
           <w:ilvl w:val="1"/>
-          <w:numId w:val="1015"/>
+          <w:numId w:val="1023"/>
         </w:numPr>
       </w:pPr>
       <w:r>
@@ -4424,7 +4452,7 @@
       <w:pPr>
         <w:numPr>
           <w:ilvl w:val="0"/>
-          <w:numId w:val="1014"/>
+          <w:numId w:val="1022"/>
         </w:numPr>
       </w:pPr>
       <w:r>
@@ -4475,7 +4503,7 @@
         <w:pStyle w:val="Compact"/>
         <w:numPr>
           <w:ilvl w:val="1"/>
-          <w:numId w:val="1016"/>
+          <w:numId w:val="1024"/>
         </w:numPr>
       </w:pPr>
       <w:r>
@@ -4487,7 +4515,7 @@
         <w:pStyle w:val="Compact"/>
         <w:numPr>
           <w:ilvl w:val="1"/>
-          <w:numId w:val="1016"/>
+          <w:numId w:val="1024"/>
         </w:numPr>
       </w:pPr>
       <w:r>
@@ -4498,7 +4526,7 @@
       <w:pPr>
         <w:numPr>
           <w:ilvl w:val="0"/>
-          <w:numId w:val="1014"/>
+          <w:numId w:val="1022"/>
         </w:numPr>
       </w:pPr>
       <w:r>
@@ -4615,7 +4643,7 @@
         <w:pStyle w:val="Compact"/>
         <w:numPr>
           <w:ilvl w:val="1"/>
-          <w:numId w:val="1017"/>
+          <w:numId w:val="1025"/>
         </w:numPr>
       </w:pPr>
       <w:r>
@@ -4627,7 +4655,7 @@
         <w:pStyle w:val="Compact"/>
         <w:numPr>
           <w:ilvl w:val="1"/>
-          <w:numId w:val="1017"/>
+          <w:numId w:val="1025"/>
         </w:numPr>
       </w:pPr>
       <w:r>
@@ -4680,7 +4708,7 @@
         <w:pStyle w:val="Compact"/>
         <w:numPr>
           <w:ilvl w:val="0"/>
-          <w:numId w:val="1018"/>
+          <w:numId w:val="1026"/>
         </w:numPr>
       </w:pPr>
       <w:r>
@@ -4763,7 +4791,7 @@
         <w:pStyle w:val="Compact"/>
         <w:numPr>
           <w:ilvl w:val="0"/>
-          <w:numId w:val="1019"/>
+          <w:numId w:val="1027"/>
         </w:numPr>
       </w:pPr>
       <w:r>
@@ -4792,7 +4820,7 @@
         <w:pStyle w:val="Compact"/>
         <w:numPr>
           <w:ilvl w:val="0"/>
-          <w:numId w:val="1020"/>
+          <w:numId w:val="1028"/>
         </w:numPr>
       </w:pPr>
       <w:r>
@@ -4804,7 +4832,7 @@
         <w:pStyle w:val="Compact"/>
         <w:numPr>
           <w:ilvl w:val="1"/>
-          <w:numId w:val="1021"/>
+          <w:numId w:val="1029"/>
         </w:numPr>
       </w:pPr>
       <w:r>
@@ -4816,7 +4844,7 @@
         <w:pStyle w:val="Compact"/>
         <w:numPr>
           <w:ilvl w:val="1"/>
-          <w:numId w:val="1021"/>
+          <w:numId w:val="1029"/>
         </w:numPr>
       </w:pPr>
       <w:r>
@@ -4828,7 +4856,7 @@
         <w:pStyle w:val="Compact"/>
         <w:numPr>
           <w:ilvl w:val="1"/>
-          <w:numId w:val="1021"/>
+          <w:numId w:val="1029"/>
         </w:numPr>
       </w:pPr>
       <w:r>
@@ -5247,7 +5275,7 @@
       <w:pPr>
         <w:numPr>
           <w:ilvl w:val="0"/>
-          <w:numId w:val="1022"/>
+          <w:numId w:val="1030"/>
         </w:numPr>
       </w:pPr>
       <w:r>
@@ -5274,7 +5302,7 @@
       <w:pPr>
         <w:numPr>
           <w:ilvl w:val="0"/>
-          <w:numId w:val="1022"/>
+          <w:numId w:val="1030"/>
         </w:numPr>
       </w:pPr>
       <w:r>
@@ -5295,7 +5323,7 @@
       <w:pPr>
         <w:numPr>
           <w:ilvl w:val="0"/>
-          <w:numId w:val="1022"/>
+          <w:numId w:val="1030"/>
         </w:numPr>
       </w:pPr>
       <w:r>
@@ -5322,7 +5350,7 @@
       <w:pPr>
         <w:numPr>
           <w:ilvl w:val="0"/>
-          <w:numId w:val="1022"/>
+          <w:numId w:val="1030"/>
         </w:numPr>
       </w:pPr>
       <w:r>
@@ -7916,7 +7944,7 @@
         <w:pStyle w:val="Compact"/>
         <w:numPr>
           <w:ilvl w:val="0"/>
-          <w:numId w:val="1023"/>
+          <w:numId w:val="1031"/>
         </w:numPr>
       </w:pPr>
       <w:r>
@@ -7938,7 +7966,7 @@
         <w:pStyle w:val="Compact"/>
         <w:numPr>
           <w:ilvl w:val="1"/>
-          <w:numId w:val="1024"/>
+          <w:numId w:val="1032"/>
         </w:numPr>
       </w:pPr>
       <w:r>
@@ -7956,7 +7984,7 @@
         <w:pStyle w:val="Compact"/>
         <w:numPr>
           <w:ilvl w:val="0"/>
-          <w:numId w:val="1023"/>
+          <w:numId w:val="1031"/>
         </w:numPr>
       </w:pPr>
       <w:r>
@@ -7978,7 +8006,7 @@
         <w:pStyle w:val="Compact"/>
         <w:numPr>
           <w:ilvl w:val="1"/>
-          <w:numId w:val="1025"/>
+          <w:numId w:val="1033"/>
         </w:numPr>
       </w:pPr>
       <w:r>
@@ -7996,7 +8024,7 @@
         <w:pStyle w:val="Compact"/>
         <w:numPr>
           <w:ilvl w:val="0"/>
-          <w:numId w:val="1023"/>
+          <w:numId w:val="1031"/>
         </w:numPr>
       </w:pPr>
       <w:r>
@@ -8018,7 +8046,7 @@
         <w:pStyle w:val="Compact"/>
         <w:numPr>
           <w:ilvl w:val="1"/>
-          <w:numId w:val="1026"/>
+          <w:numId w:val="1034"/>
         </w:numPr>
       </w:pPr>
       <w:r>
@@ -8096,7 +8124,7 @@
         <w:pStyle w:val="Compact"/>
         <w:numPr>
           <w:ilvl w:val="0"/>
-          <w:numId w:val="1027"/>
+          <w:numId w:val="1035"/>
         </w:numPr>
       </w:pPr>
       <w:r>
@@ -8112,7 +8140,7 @@
         <w:pStyle w:val="Compact"/>
         <w:numPr>
           <w:ilvl w:val="1"/>
-          <w:numId w:val="1028"/>
+          <w:numId w:val="1036"/>
         </w:numPr>
       </w:pPr>
       <w:r>
@@ -8124,7 +8152,7 @@
         <w:pStyle w:val="Compact"/>
         <w:numPr>
           <w:ilvl w:val="1"/>
-          <w:numId w:val="1028"/>
+          <w:numId w:val="1036"/>
         </w:numPr>
       </w:pPr>
       <w:r>
@@ -8136,7 +8164,7 @@
         <w:pStyle w:val="Compact"/>
         <w:numPr>
           <w:ilvl w:val="0"/>
-          <w:numId w:val="1027"/>
+          <w:numId w:val="1035"/>
         </w:numPr>
       </w:pPr>
       <w:r>
@@ -8152,7 +8180,7 @@
         <w:pStyle w:val="Compact"/>
         <w:numPr>
           <w:ilvl w:val="1"/>
-          <w:numId w:val="1029"/>
+          <w:numId w:val="1037"/>
         </w:numPr>
       </w:pPr>
       <w:r>
@@ -8164,7 +8192,7 @@
         <w:pStyle w:val="Compact"/>
         <w:numPr>
           <w:ilvl w:val="1"/>
-          <w:numId w:val="1029"/>
+          <w:numId w:val="1037"/>
         </w:numPr>
       </w:pPr>
       <w:r>
@@ -8176,7 +8204,7 @@
         <w:pStyle w:val="Compact"/>
         <w:numPr>
           <w:ilvl w:val="0"/>
-          <w:numId w:val="1027"/>
+          <w:numId w:val="1035"/>
         </w:numPr>
       </w:pPr>
       <w:r>
@@ -8192,7 +8220,7 @@
         <w:pStyle w:val="Compact"/>
         <w:numPr>
           <w:ilvl w:val="1"/>
-          <w:numId w:val="1030"/>
+          <w:numId w:val="1038"/>
         </w:numPr>
       </w:pPr>
       <w:r>
@@ -8204,7 +8232,7 @@
         <w:pStyle w:val="Compact"/>
         <w:numPr>
           <w:ilvl w:val="1"/>
-          <w:numId w:val="1030"/>
+          <w:numId w:val="1038"/>
         </w:numPr>
       </w:pPr>
       <w:r>
@@ -8216,7 +8244,7 @@
         <w:pStyle w:val="Compact"/>
         <w:numPr>
           <w:ilvl w:val="0"/>
-          <w:numId w:val="1027"/>
+          <w:numId w:val="1035"/>
         </w:numPr>
       </w:pPr>
       <w:r>
@@ -8232,7 +8260,7 @@
         <w:pStyle w:val="Compact"/>
         <w:numPr>
           <w:ilvl w:val="1"/>
-          <w:numId w:val="1031"/>
+          <w:numId w:val="1039"/>
         </w:numPr>
       </w:pPr>
       <w:r>
@@ -8244,7 +8272,7 @@
         <w:pStyle w:val="Compact"/>
         <w:numPr>
           <w:ilvl w:val="1"/>
-          <w:numId w:val="1031"/>
+          <w:numId w:val="1039"/>
         </w:numPr>
       </w:pPr>
       <w:r>
@@ -8256,7 +8284,7 @@
         <w:pStyle w:val="Compact"/>
         <w:numPr>
           <w:ilvl w:val="0"/>
-          <w:numId w:val="1027"/>
+          <w:numId w:val="1035"/>
         </w:numPr>
       </w:pPr>
       <w:r>
@@ -8278,7 +8306,7 @@
         <w:pStyle w:val="Compact"/>
         <w:numPr>
           <w:ilvl w:val="1"/>
-          <w:numId w:val="1032"/>
+          <w:numId w:val="1040"/>
         </w:numPr>
       </w:pPr>
       <w:r>
@@ -8290,7 +8318,7 @@
         <w:pStyle w:val="Compact"/>
         <w:numPr>
           <w:ilvl w:val="1"/>
-          <w:numId w:val="1032"/>
+          <w:numId w:val="1040"/>
         </w:numPr>
       </w:pPr>
       <w:r>
@@ -8567,7 +8595,7 @@
         <w:pStyle w:val="Compact"/>
         <w:numPr>
           <w:ilvl w:val="0"/>
-          <w:numId w:val="1033"/>
+          <w:numId w:val="1041"/>
         </w:numPr>
       </w:pPr>
       <w:r>
@@ -8583,7 +8611,7 @@
         <w:pStyle w:val="Compact"/>
         <w:numPr>
           <w:ilvl w:val="1"/>
-          <w:numId w:val="1034"/>
+          <w:numId w:val="1042"/>
         </w:numPr>
       </w:pPr>
       <w:r>
@@ -8595,7 +8623,7 @@
         <w:pStyle w:val="Compact"/>
         <w:numPr>
           <w:ilvl w:val="1"/>
-          <w:numId w:val="1034"/>
+          <w:numId w:val="1042"/>
         </w:numPr>
       </w:pPr>
       <w:r>
@@ -8607,7 +8635,7 @@
         <w:pStyle w:val="Compact"/>
         <w:numPr>
           <w:ilvl w:val="1"/>
-          <w:numId w:val="1034"/>
+          <w:numId w:val="1042"/>
         </w:numPr>
       </w:pPr>
       <w:r>
@@ -8619,7 +8647,7 @@
         <w:pStyle w:val="Compact"/>
         <w:numPr>
           <w:ilvl w:val="0"/>
-          <w:numId w:val="1033"/>
+          <w:numId w:val="1041"/>
         </w:numPr>
       </w:pPr>
       <w:r>
@@ -8635,7 +8663,7 @@
         <w:pStyle w:val="Compact"/>
         <w:numPr>
           <w:ilvl w:val="1"/>
-          <w:numId w:val="1035"/>
+          <w:numId w:val="1043"/>
         </w:numPr>
       </w:pPr>
       <w:r>
@@ -8647,7 +8675,7 @@
         <w:pStyle w:val="Compact"/>
         <w:numPr>
           <w:ilvl w:val="1"/>
-          <w:numId w:val="1035"/>
+          <w:numId w:val="1043"/>
         </w:numPr>
       </w:pPr>
       <w:r>
@@ -8659,7 +8687,7 @@
         <w:pStyle w:val="Compact"/>
         <w:numPr>
           <w:ilvl w:val="0"/>
-          <w:numId w:val="1033"/>
+          <w:numId w:val="1041"/>
         </w:numPr>
       </w:pPr>
       <w:r>
@@ -8675,7 +8703,7 @@
         <w:pStyle w:val="Compact"/>
         <w:numPr>
           <w:ilvl w:val="1"/>
-          <w:numId w:val="1036"/>
+          <w:numId w:val="1044"/>
         </w:numPr>
       </w:pPr>
       <w:r>
@@ -8687,7 +8715,7 @@
         <w:pStyle w:val="Compact"/>
         <w:numPr>
           <w:ilvl w:val="1"/>
-          <w:numId w:val="1036"/>
+          <w:numId w:val="1044"/>
         </w:numPr>
       </w:pPr>
       <w:r>
@@ -8699,7 +8727,7 @@
         <w:pStyle w:val="Compact"/>
         <w:numPr>
           <w:ilvl w:val="0"/>
-          <w:numId w:val="1033"/>
+          <w:numId w:val="1041"/>
         </w:numPr>
       </w:pPr>
       <w:r>
@@ -8715,7 +8743,7 @@
         <w:pStyle w:val="Compact"/>
         <w:numPr>
           <w:ilvl w:val="1"/>
-          <w:numId w:val="1037"/>
+          <w:numId w:val="1045"/>
         </w:numPr>
       </w:pPr>
       <w:r>
@@ -8727,7 +8755,7 @@
         <w:pStyle w:val="Compact"/>
         <w:numPr>
           <w:ilvl w:val="1"/>
-          <w:numId w:val="1037"/>
+          <w:numId w:val="1045"/>
         </w:numPr>
       </w:pPr>
       <w:r>
@@ -9626,7 +9654,7 @@
         <w:pStyle w:val="Compact"/>
         <w:numPr>
           <w:ilvl w:val="0"/>
-          <w:numId w:val="1038"/>
+          <w:numId w:val="1046"/>
         </w:numPr>
       </w:pPr>
       <w:r>
@@ -9645,7 +9673,7 @@
         <w:pStyle w:val="Compact"/>
         <w:numPr>
           <w:ilvl w:val="1"/>
-          <w:numId w:val="1039"/>
+          <w:numId w:val="1047"/>
         </w:numPr>
       </w:pPr>
       <w:r>
@@ -9657,7 +9685,7 @@
         <w:pStyle w:val="Compact"/>
         <w:numPr>
           <w:ilvl w:val="1"/>
-          <w:numId w:val="1039"/>
+          <w:numId w:val="1047"/>
         </w:numPr>
       </w:pPr>
       <w:r>
@@ -9669,7 +9697,7 @@
         <w:pStyle w:val="Compact"/>
         <w:numPr>
           <w:ilvl w:val="1"/>
-          <w:numId w:val="1039"/>
+          <w:numId w:val="1047"/>
         </w:numPr>
       </w:pPr>
       <w:r>
@@ -9681,7 +9709,7 @@
         <w:pStyle w:val="Compact"/>
         <w:numPr>
           <w:ilvl w:val="0"/>
-          <w:numId w:val="1038"/>
+          <w:numId w:val="1046"/>
         </w:numPr>
       </w:pPr>
       <w:r>
@@ -9697,7 +9725,7 @@
         <w:pStyle w:val="Compact"/>
         <w:numPr>
           <w:ilvl w:val="1"/>
-          <w:numId w:val="1040"/>
+          <w:numId w:val="1048"/>
         </w:numPr>
       </w:pPr>
       <w:r>
@@ -9709,7 +9737,7 @@
         <w:pStyle w:val="Compact"/>
         <w:numPr>
           <w:ilvl w:val="1"/>
-          <w:numId w:val="1040"/>
+          <w:numId w:val="1048"/>
         </w:numPr>
       </w:pPr>
       <w:r>
@@ -9721,7 +9749,7 @@
         <w:pStyle w:val="Compact"/>
         <w:numPr>
           <w:ilvl w:val="1"/>
-          <w:numId w:val="1040"/>
+          <w:numId w:val="1048"/>
         </w:numPr>
       </w:pPr>
       <w:r>
@@ -9739,7 +9767,7 @@
         <w:pStyle w:val="Compact"/>
         <w:numPr>
           <w:ilvl w:val="0"/>
-          <w:numId w:val="1038"/>
+          <w:numId w:val="1046"/>
         </w:numPr>
       </w:pPr>
       <w:r>
@@ -9755,7 +9783,7 @@
         <w:pStyle w:val="Compact"/>
         <w:numPr>
           <w:ilvl w:val="1"/>
-          <w:numId w:val="1041"/>
+          <w:numId w:val="1049"/>
         </w:numPr>
       </w:pPr>
       <w:r>
@@ -9767,7 +9795,7 @@
         <w:pStyle w:val="Compact"/>
         <w:numPr>
           <w:ilvl w:val="1"/>
-          <w:numId w:val="1041"/>
+          <w:numId w:val="1049"/>
         </w:numPr>
       </w:pPr>
       <w:r>
@@ -9779,7 +9807,7 @@
         <w:pStyle w:val="Compact"/>
         <w:numPr>
           <w:ilvl w:val="1"/>
-          <w:numId w:val="1041"/>
+          <w:numId w:val="1049"/>
         </w:numPr>
       </w:pPr>
       <w:r>
@@ -9801,7 +9829,7 @@
         <w:pStyle w:val="Compact"/>
         <w:numPr>
           <w:ilvl w:val="0"/>
-          <w:numId w:val="1042"/>
+          <w:numId w:val="1050"/>
         </w:numPr>
       </w:pPr>
       <w:r>
@@ -9813,7 +9841,7 @@
         <w:pStyle w:val="Compact"/>
         <w:numPr>
           <w:ilvl w:val="0"/>
-          <w:numId w:val="1042"/>
+          <w:numId w:val="1050"/>
         </w:numPr>
       </w:pPr>
       <w:r>
@@ -9825,7 +9853,7 @@
         <w:pStyle w:val="Compact"/>
         <w:numPr>
           <w:ilvl w:val="0"/>
-          <w:numId w:val="1042"/>
+          <w:numId w:val="1050"/>
         </w:numPr>
       </w:pPr>
       <w:r>
@@ -9837,7 +9865,7 @@
         <w:pStyle w:val="Compact"/>
         <w:numPr>
           <w:ilvl w:val="0"/>
-          <w:numId w:val="1042"/>
+          <w:numId w:val="1050"/>
         </w:numPr>
       </w:pPr>
       <w:r>
@@ -9849,7 +9877,7 @@
         <w:pStyle w:val="Compact"/>
         <w:numPr>
           <w:ilvl w:val="0"/>
-          <w:numId w:val="1042"/>
+          <w:numId w:val="1050"/>
         </w:numPr>
       </w:pPr>
       <w:r>
@@ -10370,34 +10398,7 @@
     <w:abstractNumId w:val="991"/>
   </w:num>
   <w:num w:numId="1014">
-    <w:abstractNumId w:val="99411"/>
-    <w:lvlOverride w:ilvl="0">
-      <w:startOverride w:val="1"/>
-    </w:lvlOverride>
-    <w:lvlOverride w:ilvl="1">
-      <w:startOverride w:val="1"/>
-    </w:lvlOverride>
-    <w:lvlOverride w:ilvl="2">
-      <w:startOverride w:val="1"/>
-    </w:lvlOverride>
-    <w:lvlOverride w:ilvl="3">
-      <w:startOverride w:val="1"/>
-    </w:lvlOverride>
-    <w:lvlOverride w:ilvl="4">
-      <w:startOverride w:val="1"/>
-    </w:lvlOverride>
-    <w:lvlOverride w:ilvl="5">
-      <w:startOverride w:val="1"/>
-    </w:lvlOverride>
-    <w:lvlOverride w:ilvl="6">
-      <w:startOverride w:val="1"/>
-    </w:lvlOverride>
-    <w:lvlOverride w:ilvl="7">
-      <w:startOverride w:val="1"/>
-    </w:lvlOverride>
-    <w:lvlOverride w:ilvl="8">
-      <w:startOverride w:val="1"/>
-    </w:lvlOverride>
+    <w:abstractNumId w:val="991"/>
   </w:num>
   <w:num w:numId="1015">
     <w:abstractNumId w:val="991"/>
@@ -10409,94 +10410,13 @@
     <w:abstractNumId w:val="991"/>
   </w:num>
   <w:num w:numId="1018">
-    <w:abstractNumId w:val="99411"/>
-    <w:lvlOverride w:ilvl="0">
-      <w:startOverride w:val="1"/>
-    </w:lvlOverride>
-    <w:lvlOverride w:ilvl="1">
-      <w:startOverride w:val="1"/>
-    </w:lvlOverride>
-    <w:lvlOverride w:ilvl="2">
-      <w:startOverride w:val="1"/>
-    </w:lvlOverride>
-    <w:lvlOverride w:ilvl="3">
-      <w:startOverride w:val="1"/>
-    </w:lvlOverride>
-    <w:lvlOverride w:ilvl="4">
-      <w:startOverride w:val="1"/>
-    </w:lvlOverride>
-    <w:lvlOverride w:ilvl="5">
-      <w:startOverride w:val="1"/>
-    </w:lvlOverride>
-    <w:lvlOverride w:ilvl="6">
-      <w:startOverride w:val="1"/>
-    </w:lvlOverride>
-    <w:lvlOverride w:ilvl="7">
-      <w:startOverride w:val="1"/>
-    </w:lvlOverride>
-    <w:lvlOverride w:ilvl="8">
-      <w:startOverride w:val="1"/>
-    </w:lvlOverride>
+    <w:abstractNumId w:val="991"/>
   </w:num>
   <w:num w:numId="1019">
-    <w:abstractNumId w:val="99412"/>
-    <w:lvlOverride w:ilvl="0">
-      <w:startOverride w:val="2"/>
-    </w:lvlOverride>
-    <w:lvlOverride w:ilvl="1">
-      <w:startOverride w:val="2"/>
-    </w:lvlOverride>
-    <w:lvlOverride w:ilvl="2">
-      <w:startOverride w:val="2"/>
-    </w:lvlOverride>
-    <w:lvlOverride w:ilvl="3">
-      <w:startOverride w:val="2"/>
-    </w:lvlOverride>
-    <w:lvlOverride w:ilvl="4">
-      <w:startOverride w:val="2"/>
-    </w:lvlOverride>
-    <w:lvlOverride w:ilvl="5">
-      <w:startOverride w:val="2"/>
-    </w:lvlOverride>
-    <w:lvlOverride w:ilvl="6">
-      <w:startOverride w:val="2"/>
-    </w:lvlOverride>
-    <w:lvlOverride w:ilvl="7">
-      <w:startOverride w:val="2"/>
-    </w:lvlOverride>
-    <w:lvlOverride w:ilvl="8">
-      <w:startOverride w:val="2"/>
-    </w:lvlOverride>
+    <w:abstractNumId w:val="991"/>
   </w:num>
   <w:num w:numId="1020">
-    <w:abstractNumId w:val="99413"/>
-    <w:lvlOverride w:ilvl="0">
-      <w:startOverride w:val="3"/>
-    </w:lvlOverride>
-    <w:lvlOverride w:ilvl="1">
-      <w:startOverride w:val="3"/>
-    </w:lvlOverride>
-    <w:lvlOverride w:ilvl="2">
-      <w:startOverride w:val="3"/>
-    </w:lvlOverride>
-    <w:lvlOverride w:ilvl="3">
-      <w:startOverride w:val="3"/>
-    </w:lvlOverride>
-    <w:lvlOverride w:ilvl="4">
-      <w:startOverride w:val="3"/>
-    </w:lvlOverride>
-    <w:lvlOverride w:ilvl="5">
-      <w:startOverride w:val="3"/>
-    </w:lvlOverride>
-    <w:lvlOverride w:ilvl="6">
-      <w:startOverride w:val="3"/>
-    </w:lvlOverride>
-    <w:lvlOverride w:ilvl="7">
-      <w:startOverride w:val="3"/>
-    </w:lvlOverride>
-    <w:lvlOverride w:ilvl="8">
-      <w:startOverride w:val="3"/>
-    </w:lvlOverride>
+    <w:abstractNumId w:val="991"/>
   </w:num>
   <w:num w:numId="1021">
     <w:abstractNumId w:val="991"/>
@@ -10532,6 +10452,15 @@
     </w:lvlOverride>
   </w:num>
   <w:num w:numId="1023">
+    <w:abstractNumId w:val="991"/>
+  </w:num>
+  <w:num w:numId="1024">
+    <w:abstractNumId w:val="991"/>
+  </w:num>
+  <w:num w:numId="1025">
+    <w:abstractNumId w:val="991"/>
+  </w:num>
+  <w:num w:numId="1026">
     <w:abstractNumId w:val="99411"/>
     <w:lvlOverride w:ilvl="0">
       <w:startOverride w:val="1"/>
@@ -10561,16 +10490,70 @@
       <w:startOverride w:val="1"/>
     </w:lvlOverride>
   </w:num>
-  <w:num w:numId="1024">
+  <w:num w:numId="1027">
+    <w:abstractNumId w:val="99412"/>
+    <w:lvlOverride w:ilvl="0">
+      <w:startOverride w:val="2"/>
+    </w:lvlOverride>
+    <w:lvlOverride w:ilvl="1">
+      <w:startOverride w:val="2"/>
+    </w:lvlOverride>
+    <w:lvlOverride w:ilvl="2">
+      <w:startOverride w:val="2"/>
+    </w:lvlOverride>
+    <w:lvlOverride w:ilvl="3">
+      <w:startOverride w:val="2"/>
+    </w:lvlOverride>
+    <w:lvlOverride w:ilvl="4">
+      <w:startOverride w:val="2"/>
+    </w:lvlOverride>
+    <w:lvlOverride w:ilvl="5">
+      <w:startOverride w:val="2"/>
+    </w:lvlOverride>
+    <w:lvlOverride w:ilvl="6">
+      <w:startOverride w:val="2"/>
+    </w:lvlOverride>
+    <w:lvlOverride w:ilvl="7">
+      <w:startOverride w:val="2"/>
+    </w:lvlOverride>
+    <w:lvlOverride w:ilvl="8">
+      <w:startOverride w:val="2"/>
+    </w:lvlOverride>
+  </w:num>
+  <w:num w:numId="1028">
+    <w:abstractNumId w:val="99413"/>
+    <w:lvlOverride w:ilvl="0">
+      <w:startOverride w:val="3"/>
+    </w:lvlOverride>
+    <w:lvlOverride w:ilvl="1">
+      <w:startOverride w:val="3"/>
+    </w:lvlOverride>
+    <w:lvlOverride w:ilvl="2">
+      <w:startOverride w:val="3"/>
+    </w:lvlOverride>
+    <w:lvlOverride w:ilvl="3">
+      <w:startOverride w:val="3"/>
+    </w:lvlOverride>
+    <w:lvlOverride w:ilvl="4">
+      <w:startOverride w:val="3"/>
+    </w:lvlOverride>
+    <w:lvlOverride w:ilvl="5">
+      <w:startOverride w:val="3"/>
+    </w:lvlOverride>
+    <w:lvlOverride w:ilvl="6">
+      <w:startOverride w:val="3"/>
+    </w:lvlOverride>
+    <w:lvlOverride w:ilvl="7">
+      <w:startOverride w:val="3"/>
+    </w:lvlOverride>
+    <w:lvlOverride w:ilvl="8">
+      <w:startOverride w:val="3"/>
+    </w:lvlOverride>
+  </w:num>
+  <w:num w:numId="1029">
     <w:abstractNumId w:val="991"/>
   </w:num>
-  <w:num w:numId="1025">
-    <w:abstractNumId w:val="991"/>
-  </w:num>
-  <w:num w:numId="1026">
-    <w:abstractNumId w:val="991"/>
-  </w:num>
-  <w:num w:numId="1027">
+  <w:num w:numId="1030">
     <w:abstractNumId w:val="99411"/>
     <w:lvlOverride w:ilvl="0">
       <w:startOverride w:val="1"/>
@@ -10600,22 +10583,7 @@
       <w:startOverride w:val="1"/>
     </w:lvlOverride>
   </w:num>
-  <w:num w:numId="1028">
-    <w:abstractNumId w:val="991"/>
-  </w:num>
-  <w:num w:numId="1029">
-    <w:abstractNumId w:val="991"/>
-  </w:num>
-  <w:num w:numId="1030">
-    <w:abstractNumId w:val="991"/>
-  </w:num>
   <w:num w:numId="1031">
-    <w:abstractNumId w:val="991"/>
-  </w:num>
-  <w:num w:numId="1032">
-    <w:abstractNumId w:val="991"/>
-  </w:num>
-  <w:num w:numId="1033">
     <w:abstractNumId w:val="99411"/>
     <w:lvlOverride w:ilvl="0">
       <w:startOverride w:val="1"/>
@@ -10645,19 +10613,16 @@
       <w:startOverride w:val="1"/>
     </w:lvlOverride>
   </w:num>
+  <w:num w:numId="1032">
+    <w:abstractNumId w:val="991"/>
+  </w:num>
+  <w:num w:numId="1033">
+    <w:abstractNumId w:val="991"/>
+  </w:num>
   <w:num w:numId="1034">
     <w:abstractNumId w:val="991"/>
   </w:num>
   <w:num w:numId="1035">
-    <w:abstractNumId w:val="991"/>
-  </w:num>
-  <w:num w:numId="1036">
-    <w:abstractNumId w:val="991"/>
-  </w:num>
-  <w:num w:numId="1037">
-    <w:abstractNumId w:val="991"/>
-  </w:num>
-  <w:num w:numId="1038">
     <w:abstractNumId w:val="99411"/>
     <w:lvlOverride w:ilvl="0">
       <w:startOverride w:val="1"/>
@@ -10687,6 +10652,15 @@
       <w:startOverride w:val="1"/>
     </w:lvlOverride>
   </w:num>
+  <w:num w:numId="1036">
+    <w:abstractNumId w:val="991"/>
+  </w:num>
+  <w:num w:numId="1037">
+    <w:abstractNumId w:val="991"/>
+  </w:num>
+  <w:num w:numId="1038">
+    <w:abstractNumId w:val="991"/>
+  </w:num>
   <w:num w:numId="1039">
     <w:abstractNumId w:val="991"/>
   </w:num>
@@ -10694,9 +10668,87 @@
     <w:abstractNumId w:val="991"/>
   </w:num>
   <w:num w:numId="1041">
+    <w:abstractNumId w:val="99411"/>
+    <w:lvlOverride w:ilvl="0">
+      <w:startOverride w:val="1"/>
+    </w:lvlOverride>
+    <w:lvlOverride w:ilvl="1">
+      <w:startOverride w:val="1"/>
+    </w:lvlOverride>
+    <w:lvlOverride w:ilvl="2">
+      <w:startOverride w:val="1"/>
+    </w:lvlOverride>
+    <w:lvlOverride w:ilvl="3">
+      <w:startOverride w:val="1"/>
+    </w:lvlOverride>
+    <w:lvlOverride w:ilvl="4">
+      <w:startOverride w:val="1"/>
+    </w:lvlOverride>
+    <w:lvlOverride w:ilvl="5">
+      <w:startOverride w:val="1"/>
+    </w:lvlOverride>
+    <w:lvlOverride w:ilvl="6">
+      <w:startOverride w:val="1"/>
+    </w:lvlOverride>
+    <w:lvlOverride w:ilvl="7">
+      <w:startOverride w:val="1"/>
+    </w:lvlOverride>
+    <w:lvlOverride w:ilvl="8">
+      <w:startOverride w:val="1"/>
+    </w:lvlOverride>
+  </w:num>
+  <w:num w:numId="1042">
     <w:abstractNumId w:val="991"/>
   </w:num>
-  <w:num w:numId="1042">
+  <w:num w:numId="1043">
+    <w:abstractNumId w:val="991"/>
+  </w:num>
+  <w:num w:numId="1044">
+    <w:abstractNumId w:val="991"/>
+  </w:num>
+  <w:num w:numId="1045">
+    <w:abstractNumId w:val="991"/>
+  </w:num>
+  <w:num w:numId="1046">
+    <w:abstractNumId w:val="99411"/>
+    <w:lvlOverride w:ilvl="0">
+      <w:startOverride w:val="1"/>
+    </w:lvlOverride>
+    <w:lvlOverride w:ilvl="1">
+      <w:startOverride w:val="1"/>
+    </w:lvlOverride>
+    <w:lvlOverride w:ilvl="2">
+      <w:startOverride w:val="1"/>
+    </w:lvlOverride>
+    <w:lvlOverride w:ilvl="3">
+      <w:startOverride w:val="1"/>
+    </w:lvlOverride>
+    <w:lvlOverride w:ilvl="4">
+      <w:startOverride w:val="1"/>
+    </w:lvlOverride>
+    <w:lvlOverride w:ilvl="5">
+      <w:startOverride w:val="1"/>
+    </w:lvlOverride>
+    <w:lvlOverride w:ilvl="6">
+      <w:startOverride w:val="1"/>
+    </w:lvlOverride>
+    <w:lvlOverride w:ilvl="7">
+      <w:startOverride w:val="1"/>
+    </w:lvlOverride>
+    <w:lvlOverride w:ilvl="8">
+      <w:startOverride w:val="1"/>
+    </w:lvlOverride>
+  </w:num>
+  <w:num w:numId="1047">
+    <w:abstractNumId w:val="991"/>
+  </w:num>
+  <w:num w:numId="1048">
+    <w:abstractNumId w:val="991"/>
+  </w:num>
+  <w:num w:numId="1049">
+    <w:abstractNumId w:val="991"/>
+  </w:num>
+  <w:num w:numId="1050">
     <w:abstractNumId w:val="99411"/>
     <w:lvlOverride w:ilvl="0">
       <w:startOverride w:val="1"/>

</xml_diff>